<commit_message>
Deutsch 11: Kafka-Tafelscript mit These „Furcht gründet auf Kommunikationsproblemen“
Co-Authored-By: Claude Opus 5.5 <noreply@anthropic.com>
Claude-Session: https://claude.ai/code/session_01Kzh1oWiqhC6W8oSNq8mKnj
</commit_message>
<xml_diff>
--- a/Deutsch_11/Kafka_Brief_an_den_Vater/Tafelscript_Kafka_Brief_an_den_Vater.docx
+++ b/Deutsch_11/Kafka_Brief_an_den_Vater/Tafelscript_Kafka_Brief_an_den_Vater.docx
@@ -158,19 +158,19 @@
                 <w:b/>
                 <w:bCs/>
                 <w:color w:val="F5D76E"/>
-                <w:sz w:val="20"/>
-                <w:szCs w:val="20"/>
-              </w:rPr>
-              <w:t xml:space="preserve">Leitfrage: </w:t>
+                <w:sz w:val="21"/>
+                <w:szCs w:val="21"/>
+              </w:rPr>
+              <w:t xml:space="preserve">These: </w:t>
             </w:r>
             <w:r>
               <w:rPr>
                 <w:rFonts w:ascii="Calibri" w:cs="Calibri" w:eastAsia="Calibri" w:hAnsi="Calibri"/>
                 <w:color w:val="F3F1EA"/>
-                <w:sz w:val="20"/>
-                <w:szCs w:val="20"/>
-              </w:rPr>
-              <w:t xml:space="preserve">Warum schreibt Kafka seinem Vater, statt mit ihm zu reden?</w:t>
+                <w:sz w:val="21"/>
+                <w:szCs w:val="21"/>
+              </w:rPr>
+              <w:t xml:space="preserve">Kafkas „Furcht“ gründet auf Kommunikationsproblemen. → Beweist es mit Zitaten!</w:t>
             </w:r>
             <w:r>
               <w:rPr>
@@ -414,7 +414,7 @@
                       <w:sz w:val="18"/>
                       <w:szCs w:val="18"/>
                     </w:rPr>
-                    <w:t xml:space="preserve">Wirkung auf den Sohn</w:t>
+                    <w:t xml:space="preserve">Wirkung auf den Sohn (→ Furcht)</w:t>
                   </w:r>
                 </w:p>
               </w:tc>
@@ -1343,7 +1343,7 @@
                       <w:sz w:val="19"/>
                       <w:szCs w:val="19"/>
                     </w:rPr>
-                    <w:t xml:space="preserve">Umschreiben: Hätte das gereicht?</w:t>
+                    <w:t xml:space="preserve">These bestätigt?</w:t>
                   </w:r>
                 </w:p>
                 <w:p>
@@ -1357,7 +1357,7 @@
                       <w:sz w:val="16"/>
                       <w:szCs w:val="16"/>
                     </w:rPr>
-                    <w:t xml:space="preserve">Vater formuliert um → das Gespräch ändert sich sofort</w:t>
+                    <w:t xml:space="preserve">Ja: Drohung, Ironie, widersprüchliche Regeln, „Kein Wort der Widerrede!“</w:t>
                   </w:r>
                 </w:p>
                 <w:p>
@@ -1367,11 +1367,13 @@
                   <w:r>
                     <w:rPr>
                       <w:rFonts w:ascii="Calibri" w:cs="Calibri" w:eastAsia="Calibri" w:hAnsi="Calibri"/>
+                      <w:i/>
+                      <w:iCs/>
                       <w:color w:val="F3F1EA"/>
                       <w:sz w:val="16"/>
                       <w:szCs w:val="16"/>
                     </w:rPr>
-                    <w:t xml:space="preserve">Sohn formuliert um → prallt am Machtgefälle ab</w:t>
+                    <w:t xml:space="preserve">Aber: „Du verstärktest nur, was war“ – „Deine Hand und mein Material“</w:t>
                   </w:r>
                 </w:p>
                 <w:p>
@@ -1384,10 +1386,10 @@
                       <w:b/>
                       <w:bCs/>
                       <w:color w:val="F5D76E"/>
-                      <w:sz w:val="17"/>
-                      <w:szCs w:val="17"/>
-                    </w:rPr>
-                    <w:t xml:space="preserve">⇒ Techniken brauchen Augenhöhe. Der Stärkere muss anfangen.</w:t>
+                      <w:sz w:val="16"/>
+                      <w:szCs w:val="16"/>
+                    </w:rPr>
+                    <w:t xml:space="preserve">Umschreiben zeigt: Techniken brauchen Augenhöhe – der Stärkere muss anfangen.</w:t>
                   </w:r>
                 </w:p>
               </w:tc>
@@ -1899,7 +1901,7 @@
                 <w:sz w:val="18"/>
                 <w:szCs w:val="18"/>
               </w:rPr>
-              <w:t xml:space="preserve">Einstieg: der Briefanfang</w:t>
+              <w:t xml:space="preserve">Einstieg: Briefanfang und These</w:t>
             </w:r>
           </w:p>
         </w:tc>
@@ -1931,7 +1933,7 @@
                 <w:sz w:val="17"/>
                 <w:szCs w:val="17"/>
               </w:rPr>
-              <w:t xml:space="preserve">Überschrift, Zitat des Briefanfangs, Leitfrage</w:t>
+              <w:t xml:space="preserve">Überschrift, Zitat des Briefanfangs, These</w:t>
             </w:r>
           </w:p>
         </w:tc>
@@ -1964,7 +1966,7 @@
                 <w:sz w:val="17"/>
                 <w:szCs w:val="17"/>
               </w:rPr>
-              <w:t xml:space="preserve">Briefanfang vorlesen oder zeigen. Impuls: „Warum schreibt ein 36-Jähriger seinem Vater einen Brief, statt mit ihm zu reden?“ Zwei, drei Vermutungen sammeln, dann die Leitfrage anschreiben. Die Antwort bleibt offen bis ④.</w:t>
+              <w:t xml:space="preserve">Briefanfang vorlesen oder zeigen. Impuls: „Wovor hat ein 36-Jähriger Furcht – und warum schreibt er, statt zu reden?“ Zwei, drei Vermutungen sammeln. Dann die These anschreiben: „Kafkas ‚Furcht‘ gründet auf Kommunikationsproblemen.“ Auftrag für die Stunde: Beweist es mit Zitaten! Die Überprüfung folgt in ④.</w:t>
             </w:r>
           </w:p>
         </w:tc>
@@ -2815,7 +2817,7 @@
                 <w:sz w:val="18"/>
                 <w:szCs w:val="18"/>
               </w:rPr>
-              <w:t xml:space="preserve">Vorlesen und Diskussion</w:t>
+              <w:t xml:space="preserve">Vorlesen und Prüfung der These</w:t>
             </w:r>
           </w:p>
         </w:tc>
@@ -2880,7 +2882,7 @@
                 <w:sz w:val="17"/>
                 <w:szCs w:val="17"/>
               </w:rPr>
-              <w:t xml:space="preserve">Vorgemerkte Versionen vorlesen lassen. Impuls: „Hätte das gereicht? Wer müsste sich ändern?“ – dann: „Generationenkonflikt oder Kommunikationsproblem?“ Ergebnis: Techniken brauchen Augenhöhe.</w:t>
+              <w:t xml:space="preserve">Vorgemerkte Umschreibungen vorlesen lassen: „Hätte das gereicht? Wer müsste sich ändern?“ Dann zurück zur These: „Ist sie bewiesen?“ Gegenargument einbringen, falls es nicht von selbst kommt – Kafka schreibt selbst: „Du verstärktest nur, was war“ (S. 6) und „Deine Hand und mein Material“ waren „einander so fremd“ (S. 6). Ergebnis im Kasten ④.</w:t>
             </w:r>
           </w:p>
         </w:tc>
@@ -2912,7 +2914,7 @@
                 <w:sz w:val="17"/>
                 <w:szCs w:val="17"/>
               </w:rPr>
-              <w:t xml:space="preserve">lesen vor, diskutieren</w:t>
+              <w:t xml:space="preserve">lesen vor, prüfen die These</w:t>
             </w:r>
           </w:p>
         </w:tc>
@@ -3031,7 +3033,7 @@
                 <w:sz w:val="17"/>
                 <w:szCs w:val="17"/>
               </w:rPr>
-              <w:t xml:space="preserve">Pfeil von ④ zurück zur Leitfrage, Zitat ergänzen</w:t>
+              <w:t xml:space="preserve">Pfeil von ④ zurück zur These, Zitat ergänzen</w:t>
             </w:r>
           </w:p>
         </w:tc>
@@ -3064,7 +3066,7 @@
                 <w:sz w:val="17"/>
                 <w:szCs w:val="17"/>
               </w:rPr>
-              <w:t xml:space="preserve">Die Stelle zur Widerrede vorlesen (S. 5): „… schließlich schwieg ich, zuerst vielleicht aus Trotz, dann, weil ich vor Dir weder denken noch reden konnte.“ Damit ist die Leitfrage beantwortet.</w:t>
+              <w:t xml:space="preserve">Die Stelle zur Widerrede vorlesen (S. 5 f.): „… schließlich schwieg ich, zuerst vielleicht aus Trotz, dann, weil ich vor Dir weder denken noch reden konnte.“ Die Furcht macht sprachlos – darum der Brief.</w:t>
             </w:r>
           </w:p>
         </w:tc>
@@ -3680,7 +3682,7 @@
           <w:sz w:val="24"/>
           <w:szCs w:val="24"/>
         </w:rPr>
-        <w:t xml:space="preserve">Diskussion: Generationenkonflikt oder Kommunikationsproblem?</w:t>
+        <w:t xml:space="preserve">These: Kafkas „Furcht“ gründet auf Kommunikationsproblemen – bestätigt?</w:t>
       </w:r>
     </w:p>
     <w:tbl>
@@ -3733,7 +3735,7 @@
                 <w:sz w:val="18"/>
                 <w:szCs w:val="18"/>
               </w:rPr>
-              <w:t xml:space="preserve">Generationenkonflikt: </w:t>
+              <w:t xml:space="preserve">Dafür: </w:t>
             </w:r>
             <w:r>
               <w:rPr>
@@ -3742,7 +3744,7 @@
                 <w:sz w:val="18"/>
                 <w:szCs w:val="18"/>
               </w:rPr>
-              <w:t xml:space="preserve">unterschiedliche Lebenserfahrung (Not gegen Wohlstand) und Werte (Kraft, Arbeit, Dankbarkeit gegen Empfindsamkeit, Bücher); der Vater misst den Sohn an seiner eigenen Jugend.</w:t>
+              <w:t xml:space="preserve">Drohung („ich zerreiße Dich wie einen Fisch“), Ironie mit „bösem Lachen“, Kritik über Dritte, Regeln, die nur für den Sohn gelten, und das Verbot der Widerrede machen jedes Gespräch unmöglich. Die Furcht entsteht dort, wo das Kind nichts verstehen und nichts erwidern darf.</w:t>
             </w:r>
           </w:p>
           <w:p>
@@ -3758,7 +3760,7 @@
                 <w:sz w:val="18"/>
                 <w:szCs w:val="18"/>
               </w:rPr>
-              <w:t xml:space="preserve">Kommunikationsproblem: </w:t>
+              <w:t xml:space="preserve">Dagegen / Einschränkung: </w:t>
             </w:r>
             <w:r>
               <w:rPr>
@@ -3767,7 +3769,7 @@
                 <w:sz w:val="18"/>
                 <w:szCs w:val="18"/>
               </w:rPr>
-              <w:t xml:space="preserve">Drohung, Ironie und widersprüchliche Regeln machen ein Gespräch unmöglich; Widerrede ist verboten. Der Konflikt könnte besprochen werden – wird es aber nicht.</w:t>
+              <w:t xml:space="preserve">Kafka selbst relativiert: „Du verstärktest nur, was war“ (S. 6); „Deine Hand und mein Material“ seien „einander so fremd gewesen“ (S. 6). Dazu kommen der Generationenkonflikt (Not gegen Wohlstand, Kraft gegen Empfindsamkeit) und das körperliche Gefälle („Du stark, groß, breit“).</w:t>
             </w:r>
           </w:p>
           <w:p>
@@ -3783,7 +3785,7 @@
                 <w:sz w:val="18"/>
                 <w:szCs w:val="18"/>
               </w:rPr>
-              <w:t xml:space="preserve">Zuspitzung: </w:t>
+              <w:t xml:space="preserve">Fazit: </w:t>
             </w:r>
             <w:r>
               <w:rPr>
@@ -3792,7 +3794,7 @@
                 <w:sz w:val="18"/>
                 <w:szCs w:val="18"/>
               </w:rPr>
-              <w:t xml:space="preserve">Beides hängt zusammen – der Generationenkonflikt wird erst durch die starre Komplementarität unlösbar. Der Brief ist Kafkas Versuch der Metakommunikation; er erreicht den Vater nie.</w:t>
+              <w:t xml:space="preserve">Die These trägt, braucht aber eine Ergänzung: Die Kommunikation macht aus Unterschieden Furcht. Erst die starre Komplementarität verhindert, dass der Konflikt besprochen wird. Der Brief ist Kafkas Versuch der Metakommunikation – er erreicht den Vater nie.</w:t>
             </w:r>
           </w:p>
         </w:tc>

</xml_diff>

<commit_message>
Deutsch 11: Kafka – Einstieg vor dem Diktat
Co-Authored-By: Claude Opus 5.5 <noreply@anthropic.com>
Claude-Session: https://claude.ai/code/session_01Kzh1oWiqhC6W8oSNq8mKnj
</commit_message>
<xml_diff>
--- a/Deutsch_11/Kafka_Brief_an_den_Vater/Tafelscript_Kafka_Brief_an_den_Vater.docx
+++ b/Deutsch_11/Kafka_Brief_an_den_Vater/Tafelscript_Kafka_Brief_an_den_Vater.docx
@@ -2079,7 +2079,7 @@
                 <w:sz w:val="18"/>
                 <w:szCs w:val="18"/>
               </w:rPr>
-              <w:t xml:space="preserve">0–15'</w:t>
+              <w:t xml:space="preserve">0–5'</w:t>
             </w:r>
           </w:p>
         </w:tc>
@@ -2114,7 +2114,7 @@
                 <w:sz w:val="18"/>
                 <w:szCs w:val="18"/>
               </w:rPr>
-              <w:t xml:space="preserve">Diktat + Selbstkontrolle</w:t>
+              <w:t xml:space="preserve">Einstieg</w:t>
             </w:r>
           </w:p>
         </w:tc>
@@ -2147,7 +2147,7 @@
                 <w:sz w:val="17"/>
                 <w:szCs w:val="17"/>
               </w:rPr>
-              <w:t xml:space="preserve">Diktat nach der Vorlesefassung; danach Whiteboard-Folien, Fehler farbig anstreichen und zählen. Keine Besprechung.</w:t>
+              <w:t xml:space="preserve">Briefanfang vorlesen: „Du hast mich letzthin einmal gefragt, warum ich behaupte, ich hätte Furcht vor Dir …“ Impuls: „Wovor hat ein 36-Jähriger Furcht – und warum schreibt er, statt zu reden?“ Zwei, drei Vermutungen sammeln. Dann These anschreiben: „Kafkas ‚Furcht‘ gründet auf Kommunikationsproblemen.“ Überleitung: „Bevor wir das prüfen, brauchen wir den Hintergrund – den schreibt ihr jetzt mit.“</w:t>
             </w:r>
           </w:p>
         </w:tc>
@@ -2179,7 +2179,7 @@
                 <w:sz w:val="17"/>
                 <w:szCs w:val="17"/>
               </w:rPr>
-              <w:t xml:space="preserve">–</w:t>
+              <w:t xml:space="preserve">Titel, These</w:t>
             </w:r>
           </w:p>
         </w:tc>
@@ -2211,7 +2211,7 @@
                 <w:sz w:val="17"/>
                 <w:szCs w:val="17"/>
               </w:rPr>
-              <w:t xml:space="preserve">Vorlesefassung, Whiteboard</w:t>
+              <w:t xml:space="preserve">–</w:t>
             </w:r>
           </w:p>
         </w:tc>
@@ -2252,7 +2252,7 @@
                 <w:sz w:val="18"/>
                 <w:szCs w:val="18"/>
               </w:rPr>
-              <w:t xml:space="preserve">15–20'</w:t>
+              <w:t xml:space="preserve">5–20'</w:t>
             </w:r>
           </w:p>
         </w:tc>
@@ -2287,7 +2287,7 @@
                 <w:sz w:val="18"/>
                 <w:szCs w:val="18"/>
               </w:rPr>
-              <w:t xml:space="preserve">Einstieg</w:t>
+              <w:t xml:space="preserve">Diktat + Selbstkontrolle</w:t>
             </w:r>
           </w:p>
         </w:tc>
@@ -2320,7 +2320,7 @@
                 <w:sz w:val="17"/>
                 <w:szCs w:val="17"/>
               </w:rPr>
-              <w:t xml:space="preserve">Briefanfang vorlesen: „Du hast mich letzthin einmal gefragt, warum ich behaupte, ich hätte Furcht vor Dir …“ Impuls: „Wovor hat ein 36-Jähriger Furcht – und warum schreibt er, statt zu reden?“ Dann These anschreiben: „Kafkas ‚Furcht‘ gründet auf Kommunikationsproblemen.“</w:t>
+              <w:t xml:space="preserve">Diktat nach der Vorlesefassung (Kontext + Fachbegriffe); danach Whiteboard-Folien, Fehler farbig anstreichen und zählen. Keine Besprechung. Zum Schluss den Fahrplan an die Tafel: Verstehen → Untersuchen → Schreiben.</w:t>
             </w:r>
           </w:p>
         </w:tc>
@@ -2352,7 +2352,7 @@
                 <w:sz w:val="17"/>
                 <w:szCs w:val="17"/>
               </w:rPr>
-              <w:t xml:space="preserve">Titel, These, Fahrplan (Verstehen → Untersuchen → Schreiben)</w:t>
+              <w:t xml:space="preserve">Fahrplan</w:t>
             </w:r>
           </w:p>
         </w:tc>
@@ -2384,7 +2384,7 @@
                 <w:sz w:val="17"/>
                 <w:szCs w:val="17"/>
               </w:rPr>
-              <w:t xml:space="preserve">Arbeitsblatt S. 1</w:t>
+              <w:t xml:space="preserve">Vorlesefassung, Whiteboard; Arbeitsblatt austeilen</w:t>
             </w:r>
           </w:p>
         </w:tc>

</xml_diff>